<commit_message>
fix(cv): clarify project timeline (2025 - Present) and add explicit role ownership verbs
</commit_message>
<xml_diff>
--- a/Benouali_Abdelkader_yahia_zakaria_CV.docx
+++ b/Benouali_Abdelkader_yahia_zakaria_CV.docx
@@ -259,7 +259,7 @@
         <w:rPr>
           <w:b/>
         </w:rPr>
-        <w:t>Adaptive Blended Assessment (WriteLens V2)  |  2025 – 2026</w:t>
+        <w:t>Adaptive Blended Assessment (WriteLens V2)  |  2025 – Present</w:t>
         <w:br/>
       </w:r>
       <w:r>
@@ -282,7 +282,7 @@
         <w:spacing w:before="0" w:after="30" w:line="252" w:lineRule="auto"/>
       </w:pPr>
       <w:r>
-        <w:t>Engineered an AI-driven academic writing platform processing 480+ student submissions to generate diagnostic profiles, risk bands, and cohort summaries for 60 students.</w:t>
+        <w:t>Architected and built an AI-driven academic writing platform processing 480+ student submissions to generate diagnostic profiles, risk bands, and cohort summaries for 60 students.</w:t>
       </w:r>
     </w:p>
     <w:p>
@@ -334,7 +334,7 @@
         <w:spacing w:before="0" w:after="30" w:line="252" w:lineRule="auto"/>
       </w:pPr>
       <w:r>
-        <w:t>Developed an open-source quantization toolkit compressing 7B and 13B parameter Transformer models into 4-bit and 8-bit precision for edge devices and GPUs.</w:t>
+        <w:t>Designed and implemented an open-source quantization toolkit compressing 7B and 13B parameter Transformer models into 4-bit and 8-bit precision for edge devices and GPUs.</w:t>
       </w:r>
     </w:p>
     <w:p>
@@ -377,7 +377,7 @@
         <w:spacing w:before="0" w:after="30" w:line="252" w:lineRule="auto"/>
       </w:pPr>
       <w:r>
-        <w:t>Built an environmental monitoring system processing aquatic sensor data (turbidity, dissolved oxygen) to detect water pollution in real time.</w:t>
+        <w:t>Designed and built an environmental monitoring system processing aquatic sensor data (turbidity, dissolved oxygen) to detect water pollution in real time.</w:t>
       </w:r>
     </w:p>
     <w:p>

</xml_diff>

<commit_message>
fix(cv): optimize for legacy ATS parsers (ATS-safe separators, explicit Ongoing date, soft skills keywords)
</commit_message>
<xml_diff>
--- a/Benouali_Abdelkader_yahia_zakaria_CV.docx
+++ b/Benouali_Abdelkader_yahia_zakaria_CV.docx
@@ -21,21 +21,21 @@
           <w:b/>
           <w:sz w:val="21"/>
         </w:rPr>
-        <w:t>Master's Student in AI &amp; Cybersecurity  |  AI Software Engineering Intern Candidate</w:t>
+        <w:t>Master's Student in AI and Cybersecurity  ,  AI Software Engineering Intern Candidate</w:t>
         <w:br/>
       </w:r>
       <w:r>
         <w:rPr>
           <w:sz w:val="19"/>
         </w:rPr>
-        <w:t>Ain Temouchent, Algeria  |  +213 781 306 713  |  abdelkaderbenouali301@gmail.com</w:t>
+        <w:t>Ain Temouchent, Algeria  ,  +213 781 306 713  ,  abdelkaderbenouali301@gmail.com</w:t>
         <w:br/>
       </w:r>
       <w:r>
         <w:rPr>
           <w:sz w:val="19"/>
         </w:rPr>
-        <w:t>LinkedIn: linkedin.com/in/benouali-abdelkader-yahia-zakaria-4a917a247  |  GitHub: github.com/benoualiabdelkader</w:t>
+        <w:t>LinkedIn: linkedin.com/in/benouali-abdelkader-yahia-zakaria-4a917a247  ,  GitHub: github.com/benoualiabdelkader</w:t>
         <w:br/>
       </w:r>
       <w:r>
@@ -43,7 +43,7 @@
           <w:i/>
           <w:sz w:val="19"/>
         </w:rPr>
-        <w:t>Open to Relocation &amp; Remote Roles</w:t>
+        <w:t>Open to Relocation and Remote Roles</w:t>
       </w:r>
     </w:p>
     <w:p>
@@ -76,7 +76,7 @@
         <w:spacing w:after="80" w:line="252" w:lineRule="auto"/>
       </w:pPr>
       <w:r>
-        <w:t>Master's student in AI &amp; Cybersecurity (Ranked 3rd in CS cohort) proficient in Python, C/C++, PyTorch, and Scikit-learn. Demonstrated track record in building end-to-end AI pipelines, model quantization, and deploying cloud microservices with strict privacy and security controls. Seeking the AI Software Engineering Graduate Intern role at Intel to optimize AI frameworks and drive hardware-software co-optimization.</w:t>
+        <w:t>Master's student in AI and Cybersecurity (Ranked 3rd in CS cohort) proficient in Python, C/C++, PyTorch, and Scikit-learn. Demonstrated track record in building end-to-end AI pipelines, model quantization, and deploying cloud microservices with strict privacy and security controls. Seeking the AI Software Engineering Graduate Intern role at Intel to optimize AI frameworks and drive hardware-software co-optimization.</w:t>
       </w:r>
     </w:p>
     <w:p>
@@ -113,10 +113,10 @@
         <w:rPr>
           <w:b/>
         </w:rPr>
-        <w:t xml:space="preserve">AI &amp; Machine Learning: </w:t>
+        <w:t xml:space="preserve">AI and Machine Learning: </w:t>
       </w:r>
       <w:r>
-        <w:t>PyTorch, Scikit-learn, Model Quantization, Model Optimization &amp; Fine-Tuning, LLM Pipelines, Sensor &amp; Time-Series Data Modeling</w:t>
+        <w:t>PyTorch, Scikit-learn, Model Quantization, Model Optimization and Fine-Tuning, LLM Pipelines, Sensor and Time-Series Data Modeling</w:t>
       </w:r>
     </w:p>
     <w:p>
@@ -128,10 +128,10 @@
         <w:rPr>
           <w:b/>
         </w:rPr>
-        <w:t xml:space="preserve">Languages &amp; Core CS: </w:t>
+        <w:t xml:space="preserve">Languages and Core CS: </w:t>
       </w:r>
       <w:r>
-        <w:t>Python, C, C++, Data Structures &amp; Algorithms, REST APIs, SQL, PostgreSQL</w:t>
+        <w:t>Python, C, C++, Data Structures and Algorithms, REST APIs, SQL, PostgreSQL</w:t>
       </w:r>
     </w:p>
     <w:p>
@@ -143,7 +143,7 @@
         <w:rPr>
           <w:b/>
         </w:rPr>
-        <w:t xml:space="preserve">Systems &amp; Hardware Integration: </w:t>
+        <w:t xml:space="preserve">Systems and Hardware Integration: </w:t>
       </w:r>
       <w:r>
         <w:t>Hardware-Software Integration, Docker Containerization, Linux/Windows Administration, Streamlit, Git/GitHub</w:t>
@@ -158,10 +158,10 @@
         <w:rPr>
           <w:b/>
         </w:rPr>
-        <w:t xml:space="preserve">Research &amp; Benchmarking: </w:t>
+        <w:t xml:space="preserve">Engineering Practices and Soft Skills: </w:t>
       </w:r>
       <w:r>
-        <w:t>Applied AI Research, Model Benchmarking, LaTeX Documentation, Scientific Writing, Software Debugging</w:t>
+        <w:t>Problem Solving, Cross-Functional Collaboration, Technical Leadership, Applied AI Research, Model Benchmarking</w:t>
       </w:r>
     </w:p>
     <w:p>
@@ -204,7 +204,7 @@
         <w:rPr>
           <w:b/>
         </w:rPr>
-        <w:t>Master of Science in Computer &amp; Information Sciences — AI &amp; Cybersecurity  (Sept 2025 – July 2027 Expected)</w:t>
+        <w:t>Master of Science in Computer and Information Sciences - AI and Cybersecurity  (Sept 2025 – July 2027 Expected)</w:t>
         <w:br/>
       </w:r>
       <w:r>
@@ -223,7 +223,7 @@
         <w:t xml:space="preserve">Academic Distinction: </w:t>
       </w:r>
       <w:r>
-        <w:t>Ranked 3rd out of cohort across L1 &amp; L2 semesters. Core Coursework: C Programming, Data Structures, Algorithms, Computer Architecture, Operating Systems.</w:t>
+        <w:t>Ranked 3rd out of cohort across L1 and L2 semesters. Core Coursework: C Programming, Data Structures, Algorithms, Computer Architecture, Operating Systems.</w:t>
       </w:r>
     </w:p>
     <w:p>
@@ -236,7 +236,7 @@
           <w:color w:val="003366"/>
           <w:sz w:val="22"/>
         </w:rPr>
-        <w:t>AI &amp; SOFTWARE ENGINEERING PROJECTS</w:t>
+        <w:t>AI AND SOFTWARE ENGINEERING PROJECTS</w:t>
       </w:r>
     </w:p>
     <w:p>
@@ -259,14 +259,14 @@
         <w:rPr>
           <w:b/>
         </w:rPr>
-        <w:t>Adaptive Blended Assessment (WriteLens V2)  |  2025 – Present</w:t>
+        <w:t>Adaptive Blended Assessment (WriteLens V2)  ,  2025 – Present (Ongoing)</w:t>
         <w:br/>
       </w:r>
       <w:r>
         <w:rPr>
           <w:sz w:val="18"/>
         </w:rPr>
-        <w:t xml:space="preserve">github.com/benoualiabdelkader/Adaptive-Blended-Assessment-  |  </w:t>
+        <w:t xml:space="preserve">github.com/benoualiabdelkader/Adaptive-Blended-Assessment-  ,  </w:t>
       </w:r>
       <w:r>
         <w:rPr>
@@ -311,14 +311,14 @@
         <w:rPr>
           <w:b/>
         </w:rPr>
-        <w:t>EdgeQuant — High-Speed LLM Quantization Toolkit  |  2026</w:t>
+        <w:t>EdgeQuant - High-Speed LLM Quantization Toolkit  ,  2026</w:t>
         <w:br/>
       </w:r>
       <w:r>
         <w:rPr>
           <w:sz w:val="18"/>
         </w:rPr>
-        <w:t xml:space="preserve">github.com/benoualiabdelkader/EdgeQuant  |  </w:t>
+        <w:t xml:space="preserve">github.com/benoualiabdelkader/EdgeQuant  ,  </w:t>
       </w:r>
       <w:r>
         <w:rPr>
@@ -354,14 +354,14 @@
         <w:rPr>
           <w:b/>
         </w:rPr>
-        <w:t>EcoSentinel AI — Aquatic Sensor Quality &amp; ML Pipeline  |  2026</w:t>
+        <w:t>EcoSentinel AI - Aquatic Sensor Quality and ML Pipeline  ,  2026</w:t>
         <w:br/>
       </w:r>
       <w:r>
         <w:rPr>
           <w:sz w:val="18"/>
         </w:rPr>
-        <w:t xml:space="preserve">github.com/benoualiabdelkader/eco-sentinel-project  |  </w:t>
+        <w:t xml:space="preserve">github.com/benoualiabdelkader/eco-sentinel-project  ,  </w:t>
       </w:r>
       <w:r>
         <w:rPr>
@@ -399,7 +399,7 @@
           <w:color w:val="003366"/>
           <w:sz w:val="22"/>
         </w:rPr>
-        <w:t>LEADERSHIP &amp; GLOBAL PROGRAMS</w:t>
+        <w:t>LEADERSHIP AND GLOBAL PROGRAMS</w:t>
       </w:r>
     </w:p>
     <w:p>
@@ -423,7 +423,7 @@
         <w:rPr>
           <w:b/>
         </w:rPr>
-        <w:t xml:space="preserve">Aspire Leaders Program Participant — Aspire Institute (Harvard-affiliated) (July 2026 – Present): </w:t>
+        <w:t xml:space="preserve">Aspire Leaders Program Participant - Aspire Institute (Harvard-affiliated) (July 2026 – Present): </w:t>
       </w:r>
       <w:r>
         <w:t>Selected for a global leadership program; completing coursework and masterclasses on strategic decision-making and technical leadership.</w:t>
@@ -438,7 +438,7 @@
         <w:rPr>
           <w:b/>
         </w:rPr>
-        <w:t xml:space="preserve">Participant — Erasmus+ Virtual Exchange — VIRTUALLYEDU (EU-Funded) (July 2026 – Present): </w:t>
+        <w:t xml:space="preserve">Participant - Erasmus+ Virtual Exchange - VIRTUALLYEDU (EU-Funded) (July 2026 – Present): </w:t>
       </w:r>
       <w:r>
         <w:t>Engaging in an EU-funded virtual exchange focused on digital skills, cybersecurity defense strategies, and cross-cultural technical collaboration.</w:t>
@@ -511,7 +511,7 @@
         <w:t xml:space="preserve">Algerian-American Summer University 2025: </w:t>
       </w:r>
       <w:r>
-        <w:t>Advanced Computing Track (AI, Machine Learning, Cybersecurity &amp; Ethics)</w:t>
+        <w:t>Advanced Computing Track (AI, Machine Learning, Cybersecurity and Ethics)</w:t>
       </w:r>
     </w:p>
     <w:p>
@@ -544,7 +544,7 @@
         <w:spacing w:before="40"/>
       </w:pPr>
       <w:r>
-        <w:t>Arabic: Native  |  English: B2 Level (Intermediate / Working Proficiency)  |  French: B1 Level (Working Proficiency)</w:t>
+        <w:t>Arabic: Native  ,  English: B2 Level (Intermediate / Working Proficiency)  ,  French: B1 Level (Working Proficiency)</w:t>
       </w:r>
     </w:p>
     <w:sectPr>

</xml_diff>

<commit_message>
fix(cv): streamline technical skills lists for human scannability and zero overfull line wraps
</commit_message>
<xml_diff>
--- a/Benouali_Abdelkader_yahia_zakaria_CV.docx
+++ b/Benouali_Abdelkader_yahia_zakaria_CV.docx
@@ -116,7 +116,7 @@
         <w:t xml:space="preserve">AI and Machine Learning: </w:t>
       </w:r>
       <w:r>
-        <w:t>PyTorch, Scikit-learn, Model Quantization, Model Optimization and Fine-Tuning, LLM Pipelines, Sensor and Time-Series Data Modeling</w:t>
+        <w:t>PyTorch, Scikit-learn, Model Quantization, Fine-Tuning, LLM Pipelines, Sensor Data Modeling</w:t>
       </w:r>
     </w:p>
     <w:p>
@@ -131,7 +131,7 @@
         <w:t xml:space="preserve">Languages and Core CS: </w:t>
       </w:r>
       <w:r>
-        <w:t>Python, C, C++, Data Structures and Algorithms, REST APIs, SQL, PostgreSQL</w:t>
+        <w:t>Python, C, C++, Data Structures, Algorithms, REST APIs, SQL, PostgreSQL</w:t>
       </w:r>
     </w:p>
     <w:p>
@@ -143,10 +143,10 @@
         <w:rPr>
           <w:b/>
         </w:rPr>
-        <w:t xml:space="preserve">Systems and Hardware Integration: </w:t>
+        <w:t xml:space="preserve">Systems and Cloud: </w:t>
       </w:r>
       <w:r>
-        <w:t>Hardware-Software Integration, Docker Containerization, Linux/Windows Administration, Streamlit, Git/GitHub</w:t>
+        <w:t>Hardware Integration, Docker Containerization, Linux/Windows Administration, Streamlit, Git/GitHub</w:t>
       </w:r>
     </w:p>
     <w:p>
@@ -158,10 +158,10 @@
         <w:rPr>
           <w:b/>
         </w:rPr>
-        <w:t xml:space="preserve">Engineering Practices and Soft Skills: </w:t>
+        <w:t xml:space="preserve">Engineering and Soft Skills: </w:t>
       </w:r>
       <w:r>
-        <w:t>Problem Solving, Cross-Functional Collaboration, Technical Leadership, Applied AI Research, Model Benchmarking</w:t>
+        <w:t>Problem Solving, Cross-Functional Collaboration, Technical Leadership, Model Benchmarking</w:t>
       </w:r>
     </w:p>
     <w:p>

</xml_diff>

<commit_message>
fix(cv): clean typography spacing, add Performance Benchmarking keyword for Intel, and clarify project dates
</commit_message>
<xml_diff>
--- a/Benouali_Abdelkader_yahia_zakaria_CV.docx
+++ b/Benouali_Abdelkader_yahia_zakaria_CV.docx
@@ -21,21 +21,21 @@
           <w:b/>
           <w:sz w:val="21"/>
         </w:rPr>
-        <w:t>Master's Student in AI and Cybersecurity  ,  AI Software Engineering Intern Candidate</w:t>
+        <w:t>Master's Student in AI and Cybersecurity  •  AI Software Engineering Intern Candidate</w:t>
         <w:br/>
       </w:r>
       <w:r>
         <w:rPr>
           <w:sz w:val="19"/>
         </w:rPr>
-        <w:t>Ain Temouchent, Algeria  ,  +213 781 306 713  ,  abdelkaderbenouali301@gmail.com</w:t>
+        <w:t>Ain Temouchent, Algeria  •  +213 781 306 713  •  abdelkaderbenouali301@gmail.com</w:t>
         <w:br/>
       </w:r>
       <w:r>
         <w:rPr>
           <w:sz w:val="19"/>
         </w:rPr>
-        <w:t>LinkedIn: linkedin.com/in/benouali-abdelkader-yahia-zakaria-4a917a247  ,  GitHub: github.com/benoualiabdelkader</w:t>
+        <w:t>LinkedIn: linkedin.com/in/benouali-abdelkader-yahia-zakaria-4a917a247  •  GitHub: github.com/benoualiabdelkader</w:t>
         <w:br/>
       </w:r>
       <w:r>
@@ -158,10 +158,10 @@
         <w:rPr>
           <w:b/>
         </w:rPr>
-        <w:t xml:space="preserve">Engineering and Soft Skills: </w:t>
+        <w:t xml:space="preserve">Engineering and Benchmarking: </w:t>
       </w:r>
       <w:r>
-        <w:t>Problem Solving, Cross-Functional Collaboration, Technical Leadership, Model Benchmarking</w:t>
+        <w:t>Performance Benchmarking, Problem Solving, Cross-Functional Collaboration, Technical Leadership</w:t>
       </w:r>
     </w:p>
     <w:p>
@@ -259,14 +259,14 @@
         <w:rPr>
           <w:b/>
         </w:rPr>
-        <w:t>Adaptive Blended Assessment (WriteLens V2)  ,  2025 – Present (Ongoing)</w:t>
+        <w:t>Adaptive Blended Assessment (WriteLens V2)  •  2025 – Present (Ongoing)</w:t>
         <w:br/>
       </w:r>
       <w:r>
         <w:rPr>
           <w:sz w:val="18"/>
         </w:rPr>
-        <w:t xml:space="preserve">github.com/benoualiabdelkader/Adaptive-Blended-Assessment-  ,  </w:t>
+        <w:t xml:space="preserve">github.com/benoualiabdelkader/Adaptive-Blended-Assessment-  •  </w:t>
       </w:r>
       <w:r>
         <w:rPr>
@@ -311,14 +311,14 @@
         <w:rPr>
           <w:b/>
         </w:rPr>
-        <w:t>EdgeQuant - High-Speed LLM Quantization Toolkit  ,  2026</w:t>
+        <w:t>EdgeQuant - High-Speed LLM Quantization Toolkit  •  2026</w:t>
         <w:br/>
       </w:r>
       <w:r>
         <w:rPr>
           <w:sz w:val="18"/>
         </w:rPr>
-        <w:t xml:space="preserve">github.com/benoualiabdelkader/EdgeQuant  ,  </w:t>
+        <w:t xml:space="preserve">github.com/benoualiabdelkader/EdgeQuant  •  </w:t>
       </w:r>
       <w:r>
         <w:rPr>
@@ -354,14 +354,14 @@
         <w:rPr>
           <w:b/>
         </w:rPr>
-        <w:t>EcoSentinel AI - Aquatic Sensor Quality and ML Pipeline  ,  2026</w:t>
+        <w:t>EcoSentinel AI - Aquatic Sensor Quality and ML Pipeline  •  2026</w:t>
         <w:br/>
       </w:r>
       <w:r>
         <w:rPr>
           <w:sz w:val="18"/>
         </w:rPr>
-        <w:t xml:space="preserve">github.com/benoualiabdelkader/eco-sentinel-project  ,  </w:t>
+        <w:t xml:space="preserve">github.com/benoualiabdelkader/eco-sentinel-project  •  </w:t>
       </w:r>
       <w:r>
         <w:rPr>
@@ -544,7 +544,7 @@
         <w:spacing w:before="40"/>
       </w:pPr>
       <w:r>
-        <w:t>Arabic: Native  ,  English: B2 Level (Intermediate / Working Proficiency)  ,  French: B1 Level (Working Proficiency)</w:t>
+        <w:t>Arabic: Native  •  English: B2 Level (Intermediate / Working Proficiency)  •  French: B1 Level (Working Proficiency)</w:t>
       </w:r>
     </w:p>
     <w:sectPr>

</xml_diff>

<commit_message>
fix(cv): correct Architected verb spelling, add Parallel Computing keyword, and clarify Completed project dates
</commit_message>
<xml_diff>
--- a/Benouali_Abdelkader_yahia_zakaria_CV.docx
+++ b/Benouali_Abdelkader_yahia_zakaria_CV.docx
@@ -161,7 +161,7 @@
         <w:t xml:space="preserve">Engineering and Benchmarking: </w:t>
       </w:r>
       <w:r>
-        <w:t>Performance Benchmarking, Problem Solving, Cross-Functional Collaboration, Technical Leadership</w:t>
+        <w:t>Performance Benchmarking, Parallel Computing, Problem Solving, Cross-Functional Collaboration</w:t>
       </w:r>
     </w:p>
     <w:p>
@@ -311,7 +311,7 @@
         <w:rPr>
           <w:b/>
         </w:rPr>
-        <w:t>EdgeQuant - High-Speed LLM Quantization Toolkit  •  2026</w:t>
+        <w:t>EdgeQuant - High-Speed LLM Quantization Toolkit  •  2026 (Completed)</w:t>
         <w:br/>
       </w:r>
       <w:r>
@@ -354,7 +354,7 @@
         <w:rPr>
           <w:b/>
         </w:rPr>
-        <w:t>EcoSentinel AI - Aquatic Sensor Quality and ML Pipeline  •  2026</w:t>
+        <w:t>EcoSentinel AI - Aquatic Sensor Quality and ML Pipeline  •  2026 (Completed)</w:t>
         <w:br/>
       </w:r>
       <w:r>

</xml_diff>

<commit_message>
fix(cv): enforce checklist rule #5 by removing unbacked skills and restoring provable engineering line
</commit_message>
<xml_diff>
--- a/Benouali_Abdelkader_yahia_zakaria_CV.docx
+++ b/Benouali_Abdelkader_yahia_zakaria_CV.docx
@@ -116,7 +116,7 @@
         <w:t xml:space="preserve">AI and Machine Learning: </w:t>
       </w:r>
       <w:r>
-        <w:t>PyTorch, Scikit-learn, Model Quantization, Fine-Tuning, LLM Pipelines, Sensor Data Modeling</w:t>
+        <w:t>PyTorch, Scikit-learn, Model Quantization, Fine-Tuning, LLM Pipelines, Sensor &amp; Time-Series Data Modeling</w:t>
       </w:r>
     </w:p>
     <w:p>
@@ -143,10 +143,10 @@
         <w:rPr>
           <w:b/>
         </w:rPr>
-        <w:t xml:space="preserve">Systems and Cloud: </w:t>
+        <w:t xml:space="preserve">Systems and Hardware Integration: </w:t>
       </w:r>
       <w:r>
-        <w:t>Hardware Integration, Docker Containerization, Linux/Windows Administration, Streamlit, Git/GitHub</w:t>
+        <w:t>Hardware-Software Integration, Docker Containerization, Linux/Windows Administration, Streamlit, Git/GitHub</w:t>
       </w:r>
     </w:p>
     <w:p>
@@ -161,7 +161,7 @@
         <w:t xml:space="preserve">Engineering and Benchmarking: </w:t>
       </w:r>
       <w:r>
-        <w:t>Performance Benchmarking, Parallel Computing, Problem Solving, Cross-Functional Collaboration</w:t>
+        <w:t>Performance Benchmarking, REST API Design, Software Debugging, Model Benchmarking</w:t>
       </w:r>
     </w:p>
     <w:p>

</xml_diff>